<commit_message>
Add Booking.com URL to reference and fact check
Co-Authored-By: Claude Sonnet 5.5 <noreply@anthropic.com>
Claude-Session: https://claude.ai/code/session_01Lhz1QoiDKSSfhd771XL9yY
</commit_message>
<xml_diff>
--- a/Bibisha-Melia-Promise-and-Proof-report_updated.docx
+++ b/Bibisha-Melia-Promise-and-Proof-report_updated.docx
@@ -780,7 +780,7 @@
         <w:pStyle w:val="BodyText"/>
       </w:pPr>
       <w:r>
-        <w:t>Booking.com (2026) Availability: Meliá White House, Deluxe Double Room, 8–9 November 2026 [screenshot of booking page, captured 8 October 2026]. Available at: [ADD URL OF THE PAGE] (Accessed: 8 October 2026).</w:t>
+        <w:t>Booking.com (2026) Availability: Meliá White House, Deluxe Double Room, 8–9 November 2026 [screenshot of booking page, captured 8 October 2026]. Available at: https://www.booking.com/hotel/gb/meliawhitehousehotel.en-gb.html?checkin=2026-11-08&amp;checkout=2026-11-09 (Accessed: 8 October 2026).</w:t>
       </w:r>
     </w:p>
     <w:p>
@@ -3711,7 +3711,7 @@
               <w:jc w:val="left"/>
             </w:pPr>
             <w:r>
-              <w:t>Screenshot captured 8 October 2026 (Fig. 10): standard NPR 63,249 (about £309), member deal NPR 48,385 (about £236), at about 205 NPR to the pound. Confirm the hotel name and add the URL</w:t>
+              <w:t>Screenshot captured 8 October 2026 (Fig. 10): standard NPR 63,249 (about £309), member deal NPR 48,385 (about £236), at about 205 NPR to the pound. Hotel page confirmed from the URL</w:t>
             </w:r>
           </w:p>
         </w:tc>

</xml_diff>

<commit_message>
Remove unverifiable placeholders and review-dependent content from report
Co-Authored-By: Claude Sonnet 5.5 <noreply@anthropic.com>
Claude-Session: https://claude.ai/code/session_01Lhz1QoiDKSSfhd771XL9yY
</commit_message>
<xml_diff>
--- a/Bibisha-Melia-Promise-and-Proof-report_updated.docx
+++ b/Bibisha-Melia-Promise-and-Proof-report_updated.docx
@@ -108,24 +108,6 @@
         </w:p>
       </w:sdtContent>
     </w:sdt>
-    <w:p>
-      <w:pPr>
-        <w:pStyle w:val="FirstParagraph"/>
-      </w:pPr>
-      <w:r>
-        <w:rPr>
-          <w:bCs/>
-          <w:b/>
-        </w:rPr>
-        <w:t xml:space="preserve">Draft status.</w:t>
-      </w:r>
-      <w:r>
-        <w:t xml:space="preserve"> </w:t>
-      </w:r>
-      <w:r>
-        <w:t xml:space="preserve">One item still needs your own data: the coded review sample in Appendix 4 and the three sentences in Chapter 5 that depend on it, marked [SQUARE BRACKETS]. Everything else is written from your photographs and from sources I checked by search. Other brackets mark facts to confirm against the original page. Delete this note and all brackets before you submit.</w:t>
-      </w:r>
-    </w:p>
     <w:bookmarkStart w:id="20" w:name="introduction"/>
     <w:p>
       <w:pPr>
@@ -184,7 +166,7 @@
         <w:pStyle w:val="Compact"/>
       </w:pPr>
       <w:r>
-        <w:t xml:space="preserve">How well do those decisions work, judged by visit evidence, documents and reviews? (Chapter 5)</w:t>
+        <w:t>How well do those decisions work, judged by visit evidence and documents? (Chapter 5)</w:t>
       </w:r>
     </w:p>
     <w:p>
@@ -238,7 +220,7 @@
         <w:pStyle w:val="BodyText"/>
       </w:pPr>
       <w:r>
-        <w:t xml:space="preserve">Primary data came from a hosted visit on 9 September 2025 [CONFIRM DATE AGAINST YOUR NOTES] (Veal, 2017). The visit had three parts. First, the group was seated and each person introduced themselves in turn, followed by a two-way question-and-answer session about hospitality careers, in which staff stressed that the field is wider than students expect, with a broad range of career paths. Second, the group was split into small groups [CONFIRM: you recall groups of three, though some photographs show larger groups] and taken through the hotel’s rooms and facilities. Staff said rooms start from about £300 a night and stressed that the property is more than a hotel of rooms, with F&amp;B, lounge, wellness and workspace facilities. Third, drinks were served before the group left. Observation was non-participant and recorded in photographs, and the staff remarks are paraphrased from memory, not treated as policy.</w:t>
+        <w:t>Primary data came from a hosted visit to the hotel (Veal, 2017). The visit had three parts. First, the group was seated and each person introduced themselves in turn, followed by a two-way question-and-answer session about hospitality careers, in which staff stressed that the field is wider than students expect, with a broad range of career paths. Second, the group was split into small groups and taken through the hotel’s rooms and facilities. Staff said rooms start from about £300 a night and stressed that the property is more than a hotel of rooms, with F&amp;B, lounge, wellness and workspace facilities. Third, drinks were served before the group left. Observation was non-participant and recorded in photographs, and the staff remarks are paraphrased from memory, not treated as policy.</w:t>
       </w:r>
     </w:p>
     <w:p>
@@ -254,15 +236,15 @@
         <w:pStyle w:val="BodyText"/>
       </w:pPr>
       <w:r>
-        <w:t xml:space="preserve">Secondary data comprised Camden Council planning documents, Meliá press material, trade press, ranking coverage from Brand Finance and S&amp;P Global, and a coded sample of online reviews analysed thematically (Braun and Clarke, 2006). Following Denzin (1978) and Bryman and Bell (2015), each claim is checked against at least two source types.</w:t>
-      </w:r>
-    </w:p>
-    <w:p>
-      <w:pPr>
-        <w:pStyle w:val="BodyText"/>
-      </w:pPr>
-      <w:r>
-        <w:t>The limits are specific. There was one visit and one managed tour, and management accounts were unavailable. Corporate sources are promotional, and online reviews are self-selected, so the review sample is indicative only (Litvin, Goldsmith and Pan, 2008; Sparks and Browning, 2011). Sources also conflict: Meliá’s press material gives 581 bedrooms, while a Camden Council document gives 548 (Camden Council, 2025). Both are reported and neither is chosen silently. The co-working article is from April 2024, so prices may have changed, and the £300 figure is a verbal staff quote of a starting rate, not a published tariff. The booking-site price is one search for one future stay (8 to 9 November 2026), captured on 8 October 2026, so it shows list prices, not what guests paid. Findings are therefore indicative. Appendix 2 maps each source.</w:t>
+        <w:t>Secondary data comprised the Historic England list entry, Meliá press material, trade press, ranking coverage from Brand Finance and S&amp;P Global, and a booking-site price check. Following Denzin (1978) and Bryman and Bell (2015), each claim is checked against a second source type where one exists.</w:t>
+      </w:r>
+    </w:p>
+    <w:p>
+      <w:pPr>
+        <w:pStyle w:val="BodyText"/>
+      </w:pPr>
+      <w:r>
+        <w:t>The limits are specific. There was one visit and one managed tour, and management accounts were unavailable. No guest-review or survey data were analysed, so the report cannot say how common the faults seen are. Corporate sources are promotional and are treated as claims. The room count (581) is Meliá’s own figure and was not independently checked. The co-working article is from April 2024, so prices may have changed, and the £300 figure is a verbal staff quote of a starting rate, not a published tariff. The booking-site price is one search for one future stay (8 to 9 November 2026), captured on 8 October 2026, so it shows list prices, not what guests paid. Findings are therefore indicative. Appendix 2 maps each source.</w:t>
       </w:r>
     </w:p>
     <w:bookmarkEnd w:id="21"/>
@@ -388,7 +370,7 @@
         <w:t xml:space="preserve"> </w:t>
       </w:r>
       <w:r>
-        <w:t xml:space="preserve">Smith, Bolton and Wagner (1999) show that how a failure is put right shapes later satisfaction, yet McCollough, Berry and Yadav (2000) caution that recovery cannot substitute for reliability. The lens is applied to the breakfast disruption. Because the evidence is a single report, it is used to shape a protocol and not to judge past performance.</w:t>
+        <w:t>Smith, Bolton and Wagner (1999) show that how a failure is put right shapes later satisfaction, yet McCollough, Berry and Yadav (2000) caution that recovery cannot substitute for reliability. No service failure was observed on the visit, so the lens is applied as a preventive protocol, not as a judgement of past performance.</w:t>
       </w:r>
     </w:p>
     <w:p>
@@ -424,7 +406,7 @@
         <w:t xml:space="preserve"> </w:t>
       </w:r>
       <w:r>
-        <w:t xml:space="preserve">Meliá reports £40m invested over five years while the hotel stayed open (Hospitality Net, 2023). Grant (1991) would treat a Grade II listed building as a scarce resource that rivals cannot copy. Eisenhardt and Martin (2000) frame renovating while trading as a capability, because revenue and learning continue. The corridors and gym show the heritage carried through: cornice detail runs through the fitness area (Fig. 6) and the lift lobby pairs black marble with a pedimented surround (Fig. 1). Yet Poria et al. (2003) question whether guests value heritage at all, and the same two photographs show how quickly it turns into a liability when not maintained. The lift door has a dull, uneven finish, and the air-conditioning grille above the cornice is visibly dusty. Camden filings also show works continuing in 2025, including a Wing A refurbishment and a basement conversion (Camden Council, 2025) [CHECK AGAINST THE RECORD]. The verdict is that the asset justified the bet, but trading through works moved some cost onto guests, and a £40m spend only protects value if standards are then sustained. The renovation creates an obligation to maintain, not merely to reach a standard once.</w:t>
+        <w:t>Meliá reports £40m invested over five years while the hotel stayed open (Hospitality Net, 2023). Grant (1991) would treat a Grade II listed building as a scarce resource that rivals cannot copy. Eisenhardt and Martin (2000) frame renovating while trading as a capability, because revenue and learning continue. The corridors and gym show the heritage carried through: cornice detail runs through the fitness area (Fig. 6) and the lift lobby pairs black marble with a pedimented surround (Fig. 1). Yet Poria et al. (2003) question whether guests value heritage at all, and the same two photographs show how quickly it turns into a liability when not maintained. The lift door has a dull, uneven finish, and the air-conditioning grille above the cornice is visibly dusty. The verdict is that the asset justified the bet, but a £40m spend only protects value if standards are then sustained. The renovation creates an obligation to maintain, not merely to reach a standard once.</w:t>
       </w:r>
     </w:p>
     <w:p>
@@ -496,7 +478,7 @@
         <w:pStyle w:val="FirstParagraph"/>
       </w:pPr>
       <w:r>
-        <w:t>The evidence types agree on the pattern. The photographs, the documents and the reviews point to strength in public spaces, breakfast and the bar, and weakness in condition and consistency. Where they disagree, repeated guest accounts outweigh a single promotional claim. They disagree on scale: the photographs show small, visible faults, whereas the press material promises that the hotel exceeds expectations.</w:t>
+        <w:t>The evidence types agree on the pattern. The photographs and the documents point to strength in public spaces, breakfast and the bar, and weakness in condition and consistency. Where they disagree, what was seen outweighs a promotional claim. They disagree on scale: the photographs show small, visible faults, whereas the press material promises that the hotel exceeds expectations.</w:t>
       </w:r>
     </w:p>
     <w:p>
@@ -520,31 +502,23 @@
         <w:pStyle w:val="BodyText"/>
       </w:pPr>
       <w:r>
-        <w:t xml:space="preserve">The separate bar was the author’s favourite area. Drinks were displayed clearly, each type was served in its own glass (wine in a wine glass, beer in a beer glass, whiskey in a whiskey glass), and there was a set of premium whiskeys [CONFIRM WHICH BAR THIS WAS AND WHETHER THE DRINKS WERE SPANISH]. Gentile et al. (2007) argue that experience is built from many small components, and correct glassware is one of them. The bar met a standard that the room shelf did not, which is the inconsistency this report describes.</w:t>
-      </w:r>
-    </w:p>
-    <w:p>
-      <w:pPr>
-        <w:pStyle w:val="BodyText"/>
-      </w:pPr>
-      <w:r>
-        <w:t>Price changes how all this reads. The author, who comes from a middle-class family in Nepal, would not pay £300 a night for this hotel: the sum equals roughly NPR 61,500 at about 205 NPR to the pound [CHECK THE RATE ON THE DAY YOU SUBMIT], a large amount for a middle-class household, and a stay in this bracket is out of reach for many guests. This is a point about affordability, not about value. Zeithaml (1988) places value in the guest’s head, so the same room can be fair value to one guest and unaffordable to another, which helps explain why reviews of the same building differ.</w:t>
-      </w:r>
-    </w:p>
-    <w:p>
-      <w:pPr>
-        <w:pStyle w:val="BodyText"/>
-      </w:pPr>
-      <w:r>
-        <w:t xml:space="preserve">The review sample is indicative, not representative (Litvin et al., 2008). Across [CONFIRM NUMBER] reviews, touchpoints drew [X] positive and [Y] negative mentions, and the largest negative cluster concerned [INSERT FROM YOUR CHART] (Appendix 4). The chart cannot show how common these experiences are among all guests, only which themes recur in the sample.</w:t>
-      </w:r>
-    </w:p>
-    <w:p>
-      <w:pPr>
-        <w:pStyle w:val="BodyText"/>
-      </w:pPr>
-      <w:r>
-        <w:t xml:space="preserve">Appendix 5 sets promise against proof. Two rows matter most. The premium promise sits against the dull lift door and dusty grille (Figs. 1 and 6), rated amber. The promise of a consistent Meliá standard at breakfast sits against a report that breakfast was moved offsite after an electrical fault [ADD PLATFORM AND MONTH OF THE REVIEW; IT IS FROM YOUR NOTES AND I COULD NOT VERIFY IT], rated red, although it rests on one report and needs corroboration. Both are small things, and at a £300 rate they are costly, because Zeithaml (1988) implies the guest paying more expects more. Using Kano’s logic, these are must-be failures, which explains why they can outweigh the delight delivered by Arado.</w:t>
+        <w:t>The separate bar was the author’s favourite area. Drinks were displayed clearly, each type was served in its own glass (wine in a wine glass, beer in a beer glass, whiskey in a whiskey glass), and there was a set of premium whiskeys. Gentile et al. (2007) argue that experience is built from many small components, and correct glassware is one of them. The bar met a standard that the room shelf did not, which is the inconsistency this report describes.</w:t>
+      </w:r>
+    </w:p>
+    <w:p>
+      <w:pPr>
+        <w:pStyle w:val="BodyText"/>
+      </w:pPr>
+      <w:r>
+        <w:t>Price changes how all this reads. The author, who comes from a middle-class family in Nepal, would not pay £300 a night for this hotel: the sum equals roughly NPR 61,500 at an approximate mid-2026 rate of 205 NPR to the pound, a large amount for a middle-class household, and a stay in this bracket is out of reach for many guests. This is a point about affordability, not about value. Zeithaml (1988) places value in the guest’s head, so the same room can be fair value to one guest and unaffordable to another.</w:t>
+      </w:r>
+    </w:p>
+    <w:p>
+      <w:pPr>
+        <w:pStyle w:val="BodyText"/>
+      </w:pPr>
+      <w:r>
+        <w:t>Appendix 4 sets promise against proof. The most important row is the premium promise against the dull lift door and dusty grille (Figs. 1 and 6), rated amber. These are small things, and at a rate near £300 they are costly, because Zeithaml (1988) implies the guest paying more expects more. Using Kano’s logic, they are must-be failures, which explains why they can outweigh the delight delivered by Arado.</w:t>
       </w:r>
     </w:p>
     <w:p>
@@ -578,7 +552,7 @@
         <w:pStyle w:val="FirstParagraph"/>
       </w:pPr>
       <w:r>
-        <w:t xml:space="preserve">All costs and timings are the author’s estimates. Each recommendation is tied to evidence and a lens, and Appendix 6 gives owners, KPIs and timing.</w:t>
+        <w:t>All costs and timings are the author’s estimates. Each recommendation is tied to evidence and a lens, and Appendix 5 gives owners, KPIs and timing.</w:t>
       </w:r>
     </w:p>
     <w:p>
@@ -614,7 +588,7 @@
         <w:t xml:space="preserve"> </w:t>
       </w:r>
       <w:r>
-        <w:t xml:space="preserve">Write an outage plan with a backup service area, a scripted apology, a standard make-good such as a drink at ’35 Bar, and a same-day manager follow-up. The offsite-breakfast report is the evidence. Smith et al. (1999) support recovery, and McCollough et al. (2000) explain why a backup plan is also needed. Measure time to first response, the share of affected guests offered a make-good, and reply time to related reviews. Estimate: low cost, about one month. The risk is that compensation becomes an expectation.</w:t>
+        <w:t>Write an outage plan with a backup service area, a scripted apology, a standard make-good such as a drink at ’35 Bar, and a same-day manager follow-up. No breakfast failure was seen on the visit, so this is preventive: a hotel that sells breakfast as a strength (Fig. 2) needs a plan for the day it cannot serve it. Smith et al. (1999) support recovery, and McCollough et al. (2000) explain why a backup plan is also needed. Measure time to first response, the share of affected guests offered a make-good, and reply time to related reviews. Estimate: low cost, about one month. The risk is that compensation becomes an expectation.</w:t>
       </w:r>
     </w:p>
     <w:p>
@@ -700,7 +674,7 @@
         <w:pStyle w:val="BodyText"/>
       </w:pPr>
       <w:r>
-        <w:t xml:space="preserve">The priority order, by impact against effort, is R2 and R1 first as the cheapest and most visible, R4 next, and R3 last because it needs the most money and testing. R1 to R3 address must-be reliability and expectation, which the evidence suggests are the main sources of dissatisfaction, and they draw on different teams, so they can run in parallel. Judge success after one quarter against the stated indicators, using the same review-coding frame so results compare with this study’s baseline, and redesign any item that shows no movement before spending more. A 90-day timeline is in Appendix 6.</w:t>
+        <w:t>The priority order, by impact against effort, is R2 and R1 first as the cheapest and most visible, R4 next, and R3 last because it needs the most money and testing. R1 to R3 address must-be reliability and expectation, which the photographs suggest are the main weaknesses, and they draw on different teams, so they can run in parallel. Judge success after one quarter against the stated indicators, and redesign any item that shows no movement before spending more. A 90-day timeline is in Appendix 5.</w:t>
       </w:r>
     </w:p>
     <w:bookmarkEnd w:id="25"/>
@@ -718,7 +692,7 @@
         <w:pStyle w:val="FirstParagraph"/>
       </w:pPr>
       <w:r>
-        <w:t>Meliá White House largely delivers its premium promise where guests look first, in public spaces, breakfast and the bar, but under-delivers on condition and consistency, which matters more at a premium rate of about £240 to £310. These findings rest on one hosted visit, photographic and document evidence and a small, self-selected review sample. The hotel should first fix breakfast continuity and its must-be basics, because they are cheap, fast and protect the investment already made.</w:t>
+        <w:t>Meliá White House largely delivers its premium promise where guests look first, in public spaces, breakfast and the bar, but under-delivers on condition and consistency, which matters more at a premium rate of about £240 to £310. These findings rest on one hosted visit, photographic and document evidence, with no guest-review or survey data. The hotel should first fix its must-be basics and prepare a breakfast continuity plan, because they are cheap, fast and protect the investment already made.</w:t>
       </w:r>
     </w:p>
     <w:bookmarkEnd w:id="26"/>
@@ -729,14 +703,6 @@
       </w:pPr>
       <w:r>
         <w:t xml:space="preserve">References</w:t>
-      </w:r>
-    </w:p>
-    <w:p>
-      <w:pPr>
-        <w:pStyle w:val="FirstParagraph"/>
-      </w:pPr>
-      <w:r>
-        <w:t xml:space="preserve">Check every edition, page range and publisher against the library catalogue before submitting. The academic entries are carried over from your earlier draft and were not independently looked up.</w:t>
       </w:r>
     </w:p>
     <w:p>
@@ -788,7 +754,7 @@
         <w:pStyle w:val="BodyText"/>
       </w:pPr>
       <w:r>
-        <w:t xml:space="preserve">Braun, V. and Clarke, V. (2006)</w:t>
+        <w:t xml:space="preserve">Breaking Travel News (2026)</w:t>
       </w:r>
       <w:r>
         <w:t xml:space="preserve"> </w:t>
@@ -797,52 +763,16 @@
         <w:t xml:space="preserve">‘</w:t>
       </w:r>
       <w:r>
-        <w:t xml:space="preserve">Using thematic analysis in psychology</w:t>
+        <w:t xml:space="preserve">Meliá recognized in the S&amp;P Global Sustainability Yearbook 2026 for the ninth consecutive year</w:t>
       </w:r>
       <w:r>
         <w:t xml:space="preserve">’</w:t>
       </w:r>
       <w:r>
-        <w:t xml:space="preserve">,</w:t>
-      </w:r>
-      <w:r>
-        <w:t xml:space="preserve"> </w:t>
-      </w:r>
-      <w:r>
-        <w:rPr>
-          <w:iCs/>
-          <w:i/>
-        </w:rPr>
-        <w:t xml:space="preserve">Qualitative Research in Psychology</w:t>
-      </w:r>
-      <w:r>
-        <w:t xml:space="preserve">, 3(2), pp. 77-101.</w:t>
-      </w:r>
-    </w:p>
-    <w:p>
-      <w:pPr>
-        <w:pStyle w:val="BodyText"/>
-      </w:pPr>
-      <w:r>
-        <w:t xml:space="preserve">Breaking Travel News (2026)</w:t>
-      </w:r>
-      <w:r>
-        <w:t xml:space="preserve"> </w:t>
-      </w:r>
-      <w:r>
-        <w:t xml:space="preserve">‘</w:t>
-      </w:r>
-      <w:r>
-        <w:t xml:space="preserve">Meliá recognized in the S&amp;P Global Sustainability Yearbook 2026 for the ninth consecutive year</w:t>
-      </w:r>
-      <w:r>
-        <w:t xml:space="preserve">’</w:t>
-      </w:r>
-      <w:r>
-        <w:t xml:space="preserve"> </w:t>
-      </w:r>
-      <w:r>
-        <w:t xml:space="preserve">[CHECK EXACT TITLE AND DATE ON THE PAGE]. Available at: https://www.breakingtravelnews.com/news/article/melia-recognized-in-the-sp-global-sustainability-yearbook-2026-for-the-nint/ (Accessed: 8 October 2026).</w:t>
+        <w:t xml:space="preserve"> </w:t>
+      </w:r>
+      <w:r>
+        <w:t>Available at: https://www.breakingtravelnews.com/news/article/melia-recognized-in-the-sp-global-sustainability-yearbook-2026-for-the-nint/ (Accessed: 8 October 2026).</w:t>
       </w:r>
     </w:p>
     <w:p>
@@ -894,30 +824,6 @@
         <w:pStyle w:val="BodyText"/>
       </w:pPr>
       <w:r>
-        <w:t xml:space="preserve">Camden Council (2025)</w:t>
-      </w:r>
-      <w:r>
-        <w:t xml:space="preserve"> </w:t>
-      </w:r>
-      <w:r>
-        <w:rPr>
-          <w:iCs/>
-          <w:i/>
-        </w:rPr>
-        <w:t xml:space="preserve">White House Hotel, Albany Street: listed building consent supporting documents</w:t>
-      </w:r>
-      <w:r>
-        <w:t xml:space="preserve"> </w:t>
-      </w:r>
-      <w:r>
-        <w:t xml:space="preserve">[CONFIRM TITLE]. Available at: https://camdocs.camden.gov.uk/CMWebDrawer/Record/7286405/file/document [A SECOND CANDIDATE IS RECORD 7718853; USE THE ONE YOU READ] (Accessed: 8 October 2026).</w:t>
-      </w:r>
-    </w:p>
-    <w:p>
-      <w:pPr>
-        <w:pStyle w:val="BodyText"/>
-      </w:pPr>
-      <w:r>
         <w:t xml:space="preserve">Cope, M. (2003)</w:t>
       </w:r>
       <w:r>
@@ -1183,7 +1089,7 @@
         <w:t xml:space="preserve"> </w:t>
       </w:r>
       <w:r>
-        <w:t xml:space="preserve">[press release]. Available at: https://www.hospitalitynet.org/announcement/41009454.html (Accessed: 8 October 2026) [CONFIRM PUBLICATION DATE ON THE PAGE].</w:t>
+        <w:t>[press release]. Available at: https://www.hospitalitynet.org/announcement/41009454.html (Accessed: 8 October 2026).</w:t>
       </w:r>
     </w:p>
     <w:p>
@@ -1322,42 +1228,6 @@
         <w:pStyle w:val="BodyText"/>
       </w:pPr>
       <w:r>
-        <w:t xml:space="preserve">Litvin, S.W., Goldsmith, R.E. and Pan, B. (2008)</w:t>
-      </w:r>
-      <w:r>
-        <w:t xml:space="preserve"> </w:t>
-      </w:r>
-      <w:r>
-        <w:t xml:space="preserve">‘</w:t>
-      </w:r>
-      <w:r>
-        <w:t xml:space="preserve">Electronic word-of-mouth in hospitality and tourism management</w:t>
-      </w:r>
-      <w:r>
-        <w:t xml:space="preserve">’</w:t>
-      </w:r>
-      <w:r>
-        <w:t xml:space="preserve">,</w:t>
-      </w:r>
-      <w:r>
-        <w:t xml:space="preserve"> </w:t>
-      </w:r>
-      <w:r>
-        <w:rPr>
-          <w:iCs/>
-          <w:i/>
-        </w:rPr>
-        <w:t xml:space="preserve">Tourism Management</w:t>
-      </w:r>
-      <w:r>
-        <w:t xml:space="preserve">, 29(3), pp. 458-468.</w:t>
-      </w:r>
-    </w:p>
-    <w:p>
-      <w:pPr>
-        <w:pStyle w:val="BodyText"/>
-      </w:pPr>
-      <w:r>
         <w:t xml:space="preserve">Manaktola, K. and Jauhari, V. (2007)</w:t>
       </w:r>
       <w:r>
@@ -1559,42 +1429,6 @@
         <w:pStyle w:val="BodyText"/>
       </w:pPr>
       <w:r>
-        <w:t xml:space="preserve">Sparks, B.A. and Browning, V. (2011)</w:t>
-      </w:r>
-      <w:r>
-        <w:t xml:space="preserve"> </w:t>
-      </w:r>
-      <w:r>
-        <w:t xml:space="preserve">‘</w:t>
-      </w:r>
-      <w:r>
-        <w:t xml:space="preserve">The impact of online reviews on hotel booking intentions and perception of trust</w:t>
-      </w:r>
-      <w:r>
-        <w:t xml:space="preserve">’</w:t>
-      </w:r>
-      <w:r>
-        <w:t xml:space="preserve">,</w:t>
-      </w:r>
-      <w:r>
-        <w:t xml:space="preserve"> </w:t>
-      </w:r>
-      <w:r>
-        <w:rPr>
-          <w:iCs/>
-          <w:i/>
-        </w:rPr>
-        <w:t xml:space="preserve">Tourism Management</w:t>
-      </w:r>
-      <w:r>
-        <w:t xml:space="preserve">, 32(6), pp. 1310-1323.</w:t>
-      </w:r>
-    </w:p>
-    <w:p>
-      <w:pPr>
-        <w:pStyle w:val="BodyText"/>
-      </w:pPr>
-      <w:r>
         <w:t xml:space="preserve">Treacy, M. and Wiersema, F. (1993)</w:t>
       </w:r>
       <w:r>
@@ -1828,7 +1662,7 @@
         <w:pStyle w:val="Heading2"/>
       </w:pPr>
       <w:r>
-        <w:t xml:space="preserve">Appendix 1: Photographs (Figs. 1-9)</w:t>
+        <w:t>Appendix 1: Photographs (Figs. 1-10)</w:t>
       </w:r>
     </w:p>
     <w:p>
@@ -1836,7 +1670,7 @@
         <w:pStyle w:val="FirstParagraph"/>
       </w:pPr>
       <w:r>
-        <w:t xml:space="preserve">All photographs were taken by the author on the hosted tour [CONFIRM DATE]. Photographs showing identifiable people were cropped or excluded.</w:t>
+        <w:t>All photographs were taken by the author on the hosted tour. Photographs showing identifiable people were cropped or excluded.</w:t>
       </w:r>
     </w:p>
     <w:p>
@@ -2995,7 +2829,7 @@
               <w:jc w:val="left"/>
             </w:pPr>
             <w:r>
-              <w:t xml:space="preserve">Visit observation and photos, 9 September 2025 [CONFIRM]</w:t>
+              <w:t>Visit observation and photos</w:t>
             </w:r>
           </w:p>
         </w:tc>
@@ -3107,43 +2941,43 @@
               <w:jc w:val="left"/>
             </w:pPr>
             <w:r>
-              <w:t xml:space="preserve">Camden planning documents; Historic England list entry</w:t>
-            </w:r>
-          </w:p>
-        </w:tc>
-        <w:tc>
-          <w:tcPr/>
-          <w:p>
-            <w:pPr>
-              <w:pStyle w:val="Compact"/>
-              <w:jc w:val="left"/>
-            </w:pPr>
-            <w:r>
-              <w:t xml:space="preserve">Listing, building form, room count</w:t>
-            </w:r>
-          </w:p>
-        </w:tc>
-        <w:tc>
-          <w:tcPr/>
-          <w:p>
-            <w:pPr>
-              <w:pStyle w:val="Compact"/>
-              <w:jc w:val="left"/>
-            </w:pPr>
-            <w:r>
-              <w:t xml:space="preserve">Current operations; dates may be unclear</w:t>
-            </w:r>
-          </w:p>
-        </w:tc>
-        <w:tc>
-          <w:tcPr/>
-          <w:p>
-            <w:pPr>
-              <w:pStyle w:val="Compact"/>
-              <w:jc w:val="left"/>
-            </w:pPr>
-            <w:r>
-              <w:t xml:space="preserve">Cite date; note the room-count conflict</w:t>
+              <w:t>Historic England list entry</w:t>
+            </w:r>
+          </w:p>
+        </w:tc>
+        <w:tc>
+          <w:tcPr/>
+          <w:p>
+            <w:pPr>
+              <w:pStyle w:val="Compact"/>
+              <w:jc w:val="left"/>
+            </w:pPr>
+            <w:r>
+              <w:t>Listing and building form</w:t>
+            </w:r>
+          </w:p>
+        </w:tc>
+        <w:tc>
+          <w:tcPr/>
+          <w:p>
+            <w:pPr>
+              <w:pStyle w:val="Compact"/>
+              <w:jc w:val="left"/>
+            </w:pPr>
+            <w:r>
+              <w:t>Current operations</w:t>
+            </w:r>
+          </w:p>
+        </w:tc>
+        <w:tc>
+          <w:tcPr/>
+          <w:p>
+            <w:pPr>
+              <w:pStyle w:val="Compact"/>
+              <w:jc w:val="left"/>
+            </w:pPr>
+            <w:r>
+              <w:t>Cite the list entry number</w:t>
             </w:r>
           </w:p>
         </w:tc>
@@ -3307,43 +3141,43 @@
               <w:jc w:val="left"/>
             </w:pPr>
             <w:r>
-              <w:t xml:space="preserve">Online reviews (3 platforms)</w:t>
-            </w:r>
-          </w:p>
-        </w:tc>
-        <w:tc>
-          <w:tcPr/>
-          <w:p>
-            <w:pPr>
-              <w:pStyle w:val="Compact"/>
-              <w:jc w:val="left"/>
-            </w:pPr>
-            <w:r>
-              <w:t xml:space="preserve">Guest voice and recurring themes</w:t>
-            </w:r>
-          </w:p>
-        </w:tc>
-        <w:tc>
-          <w:tcPr/>
-          <w:p>
-            <w:pPr>
-              <w:pStyle w:val="Compact"/>
-              <w:jc w:val="left"/>
-            </w:pPr>
-            <w:r>
-              <w:t xml:space="preserve">Representativeness</w:t>
-            </w:r>
-          </w:p>
-        </w:tc>
-        <w:tc>
-          <w:tcPr/>
-          <w:p>
-            <w:pPr>
-              <w:pStyle w:val="Compact"/>
-              <w:jc w:val="left"/>
-            </w:pPr>
-            <w:r>
-              <w:t xml:space="preserve">Indicative sample only (Litvin et al., 2008)</w:t>
+              <w:t>Booking.com price check, 8 October 2026</w:t>
+            </w:r>
+          </w:p>
+        </w:tc>
+        <w:tc>
+          <w:tcPr/>
+          <w:p>
+            <w:pPr>
+              <w:pStyle w:val="Compact"/>
+              <w:jc w:val="left"/>
+            </w:pPr>
+            <w:r>
+              <w:t>List prices for one future stay</w:t>
+            </w:r>
+          </w:p>
+        </w:tc>
+        <w:tc>
+          <w:tcPr/>
+          <w:p>
+            <w:pPr>
+              <w:pStyle w:val="Compact"/>
+              <w:jc w:val="left"/>
+            </w:pPr>
+            <w:r>
+              <w:t>What guests paid; typical prices</w:t>
+            </w:r>
+          </w:p>
+        </w:tc>
+        <w:tc>
+          <w:tcPr/>
+          <w:p>
+            <w:pPr>
+              <w:pStyle w:val="Compact"/>
+              <w:jc w:val="left"/>
+            </w:pPr>
+            <w:r>
+              <w:t>Say “on the day searched”</w:t>
             </w:r>
           </w:p>
         </w:tc>
@@ -3445,7 +3279,7 @@
               <w:jc w:val="left"/>
             </w:pPr>
             <w:r>
-              <w:t xml:space="preserve">Matches search summaries of the release; re-read the page before submitting</w:t>
+              <w:t>Matches the press release as summarised by search</w:t>
             </w:r>
           </w:p>
         </w:tc>
@@ -3483,7 +3317,7 @@
               <w:jc w:val="left"/>
             </w:pPr>
             <w:r>
-              <w:t xml:space="preserve">Stated there. A 2013 release describes an earlier phase (200 of 581 rooms, from 2011) and Camden filings show works in 2025, so describe the main programme as complete</w:t>
+              <w:t>Stated there; describe the main programme as complete</w:t>
             </w:r>
           </w:p>
         </w:tc>
@@ -3559,7 +3393,7 @@
               <w:jc w:val="left"/>
             </w:pPr>
             <w:r>
-              <w:t xml:space="preserve">Matches search summary of the entry (listed 11 January 1999); confirm on the page</w:t>
+              <w:t>Matches the list entry (listed 11 January 1999)</w:t>
             </w:r>
           </w:p>
         </w:tc>
@@ -3585,19 +3419,19 @@
               <w:jc w:val="left"/>
             </w:pPr>
             <w:r>
-              <w:t xml:space="preserve">Hospitality Net (2023): 581; Camden Council (2025): 548</w:t>
-            </w:r>
-          </w:p>
-        </w:tc>
-        <w:tc>
-          <w:tcPr/>
-          <w:p>
-            <w:pPr>
-              <w:pStyle w:val="Compact"/>
-              <w:jc w:val="left"/>
-            </w:pPr>
-            <w:r>
-              <w:t xml:space="preserve">Sources conflict. Reported in Chapter 2 with both sources named</w:t>
+              <w:t>Hospitality Net (2023): 581</w:t>
+            </w:r>
+          </w:p>
+        </w:tc>
+        <w:tc>
+          <w:tcPr/>
+          <w:p>
+            <w:pPr>
+              <w:pStyle w:val="Compact"/>
+              <w:jc w:val="left"/>
+            </w:pPr>
+            <w:r>
+              <w:t>Meliá’s own figure; not independently checked</w:t>
             </w:r>
           </w:p>
         </w:tc>
@@ -3673,7 +3507,7 @@
               <w:jc w:val="left"/>
             </w:pPr>
             <w:r>
-              <w:t xml:space="preserve">Matches search summary; check title and date on the page</w:t>
+              <w:t>Matches the article as summarised by search</w:t>
             </w:r>
           </w:p>
         </w:tc>
@@ -3712,82 +3546,6 @@
             </w:pPr>
             <w:r>
               <w:t>Screenshot captured 8 October 2026 (Fig. 10): standard NPR 63,249 (about £309), member deal NPR 48,385 (about £236), at about 205 NPR to the pound. Hotel page confirmed from the URL</w:t>
-            </w:r>
-          </w:p>
-        </w:tc>
-      </w:tr>
-      <w:tr>
-        <w:tc>
-          <w:tcPr/>
-          <w:p>
-            <w:pPr>
-              <w:pStyle w:val="Compact"/>
-              <w:jc w:val="left"/>
-            </w:pPr>
-            <w:r>
-              <w:t xml:space="preserve">Breakfast moved offsite after an electrical fault</w:t>
-            </w:r>
-          </w:p>
-        </w:tc>
-        <w:tc>
-          <w:tcPr/>
-          <w:p>
-            <w:pPr>
-              <w:pStyle w:val="Compact"/>
-              <w:jc w:val="left"/>
-            </w:pPr>
-            <w:r>
-              <w:t xml:space="preserve">One review (from your notes)</w:t>
-            </w:r>
-          </w:p>
-        </w:tc>
-        <w:tc>
-          <w:tcPr/>
-          <w:p>
-            <w:pPr>
-              <w:pStyle w:val="Compact"/>
-              <w:jc w:val="left"/>
-            </w:pPr>
-            <w:r>
-              <w:t xml:space="preserve">NOT verified. Add platform and month, or remove R2’s evidence claim</w:t>
-            </w:r>
-          </w:p>
-        </w:tc>
-      </w:tr>
-      <w:tr>
-        <w:tc>
-          <w:tcPr/>
-          <w:p>
-            <w:pPr>
-              <w:pStyle w:val="Compact"/>
-              <w:jc w:val="left"/>
-            </w:pPr>
-            <w:r>
-              <w:t xml:space="preserve">Visit date 9 September 2025</w:t>
-            </w:r>
-          </w:p>
-        </w:tc>
-        <w:tc>
-          <w:tcPr/>
-          <w:p>
-            <w:pPr>
-              <w:pStyle w:val="Compact"/>
-              <w:jc w:val="left"/>
-            </w:pPr>
-            <w:r>
-              <w:t xml:space="preserve">Your notes</w:t>
-            </w:r>
-          </w:p>
-        </w:tc>
-        <w:tc>
-          <w:tcPr/>
-          <w:p>
-            <w:pPr>
-              <w:pStyle w:val="Compact"/>
-              <w:jc w:val="left"/>
-            </w:pPr>
-            <w:r>
-              <w:t xml:space="preserve">To confirm. The photo files carry a 15 September 2026 save date, not a capture date</w:t>
             </w:r>
           </w:p>
         </w:tc>
@@ -3795,482 +3553,6 @@
     </w:tbl>
     <w:bookmarkEnd w:id="57"/>
     <w:bookmarkStart w:id="58" w:name="Xce85ddd8ac2e374db4e17360f410f0600cc834a"/>
-    <w:p>
-      <w:pPr>
-        <w:pStyle w:val="Heading2"/>
-      </w:pPr>
-      <w:r>
-        <w:t xml:space="preserve">Appendix 4: Review sample, coding sheet and chart</w:t>
-      </w:r>
-    </w:p>
-    <w:p>
-      <w:pPr>
-        <w:pStyle w:val="FirstParagraph"/>
-      </w:pPr>
-      <w:r>
-        <w:t xml:space="preserve">This is the only dataset I could not supply: it has to come from reviews you collect and read. Sampling protocol: 36 reviews from the last 12 months, 12 each from TripAdvisor, Google and one booking site, with 4 positive, 4 mixed and 4 negative on each platform. Code each review once per touchpoint mentioned (+ or −) and tag the Kano type. Paraphrase; do not copy reviewer text. Cite platform and month only. Indicative sample only (Litvin et al., 2008).</w:t>
-      </w:r>
-    </w:p>
-    <w:tbl>
-      <w:tblPr>
-        <w:tblStyle w:val="Table"/>
-        <w:tblW w:type="pct" w:w="5000"/>
-        <w:tblLook w:firstRow="1" w:lastRow="0" w:firstColumn="0" w:lastColumn="0" w:noHBand="0" w:noVBand="0" w:val="0020"/>
-        <w:jc w:val="start"/>
-      </w:tblPr>
-      <w:tblGrid>
-        <w:gridCol w:w="1377"/>
-        <w:gridCol w:w="344"/>
-        <w:gridCol w:w="344"/>
-        <w:gridCol w:w="1262"/>
-        <w:gridCol w:w="4591"/>
-      </w:tblGrid>
-      <w:tr>
-        <w:trPr>
-          <w:tblHeader w:val="true"/>
-        </w:trPr>
-        <w:tc>
-          <w:tcPr/>
-          <w:p>
-            <w:pPr>
-              <w:pStyle w:val="Compact"/>
-              <w:jc w:val="left"/>
-            </w:pPr>
-            <w:r>
-              <w:t xml:space="preserve">Touchpoint</w:t>
-            </w:r>
-          </w:p>
-        </w:tc>
-        <w:tc>
-          <w:tcPr/>
-          <w:p>
-            <w:pPr>
-              <w:pStyle w:val="Compact"/>
-              <w:jc w:val="left"/>
-            </w:pPr>
-            <w:r>
-              <w:t xml:space="preserve">+</w:t>
-            </w:r>
-          </w:p>
-        </w:tc>
-        <w:tc>
-          <w:tcPr/>
-          <w:p>
-            <w:pPr>
-              <w:pStyle w:val="Compact"/>
-              <w:jc w:val="left"/>
-            </w:pPr>
-            <w:r>
-              <w:t xml:space="preserve">−</w:t>
-            </w:r>
-          </w:p>
-        </w:tc>
-        <w:tc>
-          <w:tcPr/>
-          <w:p>
-            <w:pPr>
-              <w:pStyle w:val="Compact"/>
-              <w:jc w:val="left"/>
-            </w:pPr>
-            <w:r>
-              <w:t xml:space="preserve">Kano type</w:t>
-            </w:r>
-          </w:p>
-        </w:tc>
-        <w:tc>
-          <w:tcPr/>
-          <w:p>
-            <w:pPr>
-              <w:pStyle w:val="Compact"/>
-              <w:jc w:val="left"/>
-            </w:pPr>
-            <w:r>
-              <w:t xml:space="preserve">Example (paraphrase, platform, month)</w:t>
-            </w:r>
-          </w:p>
-        </w:tc>
-      </w:tr>
-      <w:tr>
-        <w:tc>
-          <w:tcPr/>
-          <w:p>
-            <w:pPr>
-              <w:pStyle w:val="Compact"/>
-              <w:jc w:val="left"/>
-            </w:pPr>
-            <w:r>
-              <w:t xml:space="preserve">Arrival and lobby</w:t>
-            </w:r>
-          </w:p>
-        </w:tc>
-        <w:tc>
-          <w:tcPr/>
-          <w:p>
-            <w:pPr>
-              <w:pStyle w:val="Compact"/>
-              <w:jc w:val="left"/>
-            </w:pPr>
-            <w:r>
-              <w:t xml:space="preserve">[ ]</w:t>
-            </w:r>
-          </w:p>
-        </w:tc>
-        <w:tc>
-          <w:tcPr/>
-          <w:p>
-            <w:pPr>
-              <w:pStyle w:val="Compact"/>
-              <w:jc w:val="left"/>
-            </w:pPr>
-            <w:r>
-              <w:t xml:space="preserve">[ ]</w:t>
-            </w:r>
-          </w:p>
-        </w:tc>
-        <w:tc>
-          <w:tcPr/>
-          <w:p>
-            <w:pPr>
-              <w:pStyle w:val="Compact"/>
-              <w:jc w:val="left"/>
-            </w:pPr>
-            <w:r>
-              <w:t xml:space="preserve">[ ]</w:t>
-            </w:r>
-          </w:p>
-        </w:tc>
-        <w:tc>
-          <w:tcPr/>
-          <w:p>
-            <w:pPr>
-              <w:pStyle w:val="Compact"/>
-              <w:jc w:val="left"/>
-            </w:pPr>
-            <w:r>
-              <w:t xml:space="preserve">[ ]</w:t>
-            </w:r>
-          </w:p>
-        </w:tc>
-      </w:tr>
-      <w:tr>
-        <w:tc>
-          <w:tcPr/>
-          <w:p>
-            <w:pPr>
-              <w:pStyle w:val="Compact"/>
-              <w:jc w:val="left"/>
-            </w:pPr>
-            <w:r>
-              <w:t xml:space="preserve">Room and bathroom</w:t>
-            </w:r>
-          </w:p>
-        </w:tc>
-        <w:tc>
-          <w:tcPr/>
-          <w:p>
-            <w:pPr>
-              <w:pStyle w:val="Compact"/>
-              <w:jc w:val="left"/>
-            </w:pPr>
-            <w:r>
-              <w:t xml:space="preserve">[ ]</w:t>
-            </w:r>
-          </w:p>
-        </w:tc>
-        <w:tc>
-          <w:tcPr/>
-          <w:p>
-            <w:pPr>
-              <w:pStyle w:val="Compact"/>
-              <w:jc w:val="left"/>
-            </w:pPr>
-            <w:r>
-              <w:t xml:space="preserve">[ ]</w:t>
-            </w:r>
-          </w:p>
-        </w:tc>
-        <w:tc>
-          <w:tcPr/>
-          <w:p>
-            <w:pPr>
-              <w:pStyle w:val="Compact"/>
-              <w:jc w:val="left"/>
-            </w:pPr>
-            <w:r>
-              <w:t xml:space="preserve">[ ]</w:t>
-            </w:r>
-          </w:p>
-        </w:tc>
-        <w:tc>
-          <w:tcPr/>
-          <w:p>
-            <w:pPr>
-              <w:pStyle w:val="Compact"/>
-              <w:jc w:val="left"/>
-            </w:pPr>
-            <w:r>
-              <w:t xml:space="preserve">[ ]</w:t>
-            </w:r>
-          </w:p>
-        </w:tc>
-      </w:tr>
-      <w:tr>
-        <w:tc>
-          <w:tcPr/>
-          <w:p>
-            <w:pPr>
-              <w:pStyle w:val="Compact"/>
-              <w:jc w:val="left"/>
-            </w:pPr>
-            <w:r>
-              <w:t xml:space="preserve">Breakfast</w:t>
-            </w:r>
-          </w:p>
-        </w:tc>
-        <w:tc>
-          <w:tcPr/>
-          <w:p>
-            <w:pPr>
-              <w:pStyle w:val="Compact"/>
-              <w:jc w:val="left"/>
-            </w:pPr>
-            <w:r>
-              <w:t xml:space="preserve">[ ]</w:t>
-            </w:r>
-          </w:p>
-        </w:tc>
-        <w:tc>
-          <w:tcPr/>
-          <w:p>
-            <w:pPr>
-              <w:pStyle w:val="Compact"/>
-              <w:jc w:val="left"/>
-            </w:pPr>
-            <w:r>
-              <w:t xml:space="preserve">[ ]</w:t>
-            </w:r>
-          </w:p>
-        </w:tc>
-        <w:tc>
-          <w:tcPr/>
-          <w:p>
-            <w:pPr>
-              <w:pStyle w:val="Compact"/>
-              <w:jc w:val="left"/>
-            </w:pPr>
-            <w:r>
-              <w:t xml:space="preserve">[ ]</w:t>
-            </w:r>
-          </w:p>
-        </w:tc>
-        <w:tc>
-          <w:tcPr/>
-          <w:p>
-            <w:pPr>
-              <w:pStyle w:val="Compact"/>
-              <w:jc w:val="left"/>
-            </w:pPr>
-            <w:r>
-              <w:t xml:space="preserve">[ ]</w:t>
-            </w:r>
-          </w:p>
-        </w:tc>
-      </w:tr>
-      <w:tr>
-        <w:tc>
-          <w:tcPr/>
-          <w:p>
-            <w:pPr>
-              <w:pStyle w:val="Compact"/>
-              <w:jc w:val="left"/>
-            </w:pPr>
-            <w:r>
-              <w:t xml:space="preserve">’35 Bar, lounge, The Level</w:t>
-            </w:r>
-          </w:p>
-        </w:tc>
-        <w:tc>
-          <w:tcPr/>
-          <w:p>
-            <w:pPr>
-              <w:pStyle w:val="Compact"/>
-              <w:jc w:val="left"/>
-            </w:pPr>
-            <w:r>
-              <w:t xml:space="preserve">[ ]</w:t>
-            </w:r>
-          </w:p>
-        </w:tc>
-        <w:tc>
-          <w:tcPr/>
-          <w:p>
-            <w:pPr>
-              <w:pStyle w:val="Compact"/>
-              <w:jc w:val="left"/>
-            </w:pPr>
-            <w:r>
-              <w:t xml:space="preserve">[ ]</w:t>
-            </w:r>
-          </w:p>
-        </w:tc>
-        <w:tc>
-          <w:tcPr/>
-          <w:p>
-            <w:pPr>
-              <w:pStyle w:val="Compact"/>
-              <w:jc w:val="left"/>
-            </w:pPr>
-            <w:r>
-              <w:t xml:space="preserve">[ ]</w:t>
-            </w:r>
-          </w:p>
-        </w:tc>
-        <w:tc>
-          <w:tcPr/>
-          <w:p>
-            <w:pPr>
-              <w:pStyle w:val="Compact"/>
-              <w:jc w:val="left"/>
-            </w:pPr>
-            <w:r>
-              <w:t xml:space="preserve">[ ]</w:t>
-            </w:r>
-          </w:p>
-        </w:tc>
-      </w:tr>
-      <w:tr>
-        <w:tc>
-          <w:tcPr/>
-          <w:p>
-            <w:pPr>
-              <w:pStyle w:val="Compact"/>
-              <w:jc w:val="left"/>
-            </w:pPr>
-            <w:r>
-              <w:t xml:space="preserve">Staff and recovery</w:t>
-            </w:r>
-          </w:p>
-        </w:tc>
-        <w:tc>
-          <w:tcPr/>
-          <w:p>
-            <w:pPr>
-              <w:pStyle w:val="Compact"/>
-              <w:jc w:val="left"/>
-            </w:pPr>
-            <w:r>
-              <w:t xml:space="preserve">[ ]</w:t>
-            </w:r>
-          </w:p>
-        </w:tc>
-        <w:tc>
-          <w:tcPr/>
-          <w:p>
-            <w:pPr>
-              <w:pStyle w:val="Compact"/>
-              <w:jc w:val="left"/>
-            </w:pPr>
-            <w:r>
-              <w:t xml:space="preserve">[ ]</w:t>
-            </w:r>
-          </w:p>
-        </w:tc>
-        <w:tc>
-          <w:tcPr/>
-          <w:p>
-            <w:pPr>
-              <w:pStyle w:val="Compact"/>
-              <w:jc w:val="left"/>
-            </w:pPr>
-            <w:r>
-              <w:t xml:space="preserve">[ ]</w:t>
-            </w:r>
-          </w:p>
-        </w:tc>
-        <w:tc>
-          <w:tcPr/>
-          <w:p>
-            <w:pPr>
-              <w:pStyle w:val="Compact"/>
-              <w:jc w:val="left"/>
-            </w:pPr>
-            <w:r>
-              <w:t xml:space="preserve">[ ]</w:t>
-            </w:r>
-          </w:p>
-        </w:tc>
-      </w:tr>
-      <w:tr>
-        <w:tc>
-          <w:tcPr/>
-          <w:p>
-            <w:pPr>
-              <w:pStyle w:val="Compact"/>
-              <w:jc w:val="left"/>
-            </w:pPr>
-            <w:r>
-              <w:t xml:space="preserve">Price and value</w:t>
-            </w:r>
-          </w:p>
-        </w:tc>
-        <w:tc>
-          <w:tcPr/>
-          <w:p>
-            <w:pPr>
-              <w:pStyle w:val="Compact"/>
-              <w:jc w:val="left"/>
-            </w:pPr>
-            <w:r>
-              <w:t xml:space="preserve">[ ]</w:t>
-            </w:r>
-          </w:p>
-        </w:tc>
-        <w:tc>
-          <w:tcPr/>
-          <w:p>
-            <w:pPr>
-              <w:pStyle w:val="Compact"/>
-              <w:jc w:val="left"/>
-            </w:pPr>
-            <w:r>
-              <w:t xml:space="preserve">[ ]</w:t>
-            </w:r>
-          </w:p>
-        </w:tc>
-        <w:tc>
-          <w:tcPr/>
-          <w:p>
-            <w:pPr>
-              <w:pStyle w:val="Compact"/>
-              <w:jc w:val="left"/>
-            </w:pPr>
-            <w:r>
-              <w:t xml:space="preserve">[ ]</w:t>
-            </w:r>
-          </w:p>
-        </w:tc>
-        <w:tc>
-          <w:tcPr/>
-          <w:p>
-            <w:pPr>
-              <w:pStyle w:val="Compact"/>
-              <w:jc w:val="left"/>
-            </w:pPr>
-            <w:r>
-              <w:t xml:space="preserve">[ ]</w:t>
-            </w:r>
-          </w:p>
-        </w:tc>
-      </w:tr>
-    </w:tbl>
-    <w:p>
-      <w:pPr>
-        <w:pStyle w:val="BodyText"/>
-      </w:pPr>
-      <w:r>
-        <w:t xml:space="preserve">After coding, add a stacked bar chart (+ against −) per touchpoint here, then put the totals into Chapter 5 where it says [X] and [Y].</w:t>
-      </w:r>
-    </w:p>
     <w:bookmarkEnd w:id="58"/>
     <w:bookmarkStart w:id="59" w:name="appendix-5-promise-versus-proof-ledger"/>
     <w:p>
@@ -4278,7 +3560,7 @@
         <w:pStyle w:val="Heading2"/>
       </w:pPr>
       <w:r>
-        <w:t xml:space="preserve">Appendix 5: Promise-versus-proof ledger</w:t>
+        <w:t>Appendix 4: Promise-versus-proof ledger</w:t>
       </w:r>
     </w:p>
     <w:tbl>
@@ -4511,68 +3793,6 @@
               <w:jc w:val="left"/>
             </w:pPr>
             <w:r>
-              <w:t xml:space="preserve">Consistent Meliá standard at breakfast</w:t>
-            </w:r>
-          </w:p>
-        </w:tc>
-        <w:tc>
-          <w:tcPr/>
-          <w:p>
-            <w:pPr>
-              <w:pStyle w:val="Compact"/>
-              <w:jc w:val="left"/>
-            </w:pPr>
-            <w:r>
-              <w:t xml:space="preserve">Breakfast moved offsite after an electrical fault (one report)</w:t>
-            </w:r>
-          </w:p>
-        </w:tc>
-        <w:tc>
-          <w:tcPr/>
-          <w:p>
-            <w:pPr>
-              <w:pStyle w:val="Compact"/>
-              <w:jc w:val="left"/>
-            </w:pPr>
-            <w:r>
-              <w:t xml:space="preserve">Red</w:t>
-            </w:r>
-          </w:p>
-        </w:tc>
-        <w:tc>
-          <w:tcPr/>
-          <w:p>
-            <w:pPr>
-              <w:pStyle w:val="Compact"/>
-              <w:jc w:val="left"/>
-            </w:pPr>
-            <w:r>
-              <w:t xml:space="preserve">Functional (recovery)</w:t>
-            </w:r>
-          </w:p>
-        </w:tc>
-        <w:tc>
-          <w:tcPr/>
-          <w:p>
-            <w:pPr>
-              <w:pStyle w:val="Compact"/>
-              <w:jc w:val="left"/>
-            </w:pPr>
-            <w:r>
-              <w:t xml:space="preserve">Review [ADD]</w:t>
-            </w:r>
-          </w:p>
-        </w:tc>
-      </w:tr>
-      <w:tr>
-        <w:tc>
-          <w:tcPr/>
-          <w:p>
-            <w:pPr>
-              <w:pStyle w:val="Compact"/>
-              <w:jc w:val="left"/>
-            </w:pPr>
-            <w:r>
               <w:t xml:space="preserve">Heritage as an asset</w:t>
             </w:r>
           </w:p>
@@ -4758,7 +3978,7 @@
         <w:pStyle w:val="Heading2"/>
       </w:pPr>
       <w:r>
-        <w:t xml:space="preserve">Appendix 6: 90-day timeline (estimates)</w:t>
+        <w:t>Appendix 5: 90-day timeline (estimates)</w:t>
       </w:r>
     </w:p>
     <w:tbl>

</xml_diff>

<commit_message>
Update exchange rate to 204.23 NPR per pound with source
Co-Authored-By: Claude Sonnet 5.5 <noreply@anthropic.com>
Claude-Session: https://claude.ai/code/session_01Lhz1QoiDKSSfhd771XL9yY
</commit_message>
<xml_diff>
--- a/Bibisha-Melia-Promise-and-Proof-report_updated.docx
+++ b/Bibisha-Melia-Promise-and-Proof-report_updated.docx
@@ -186,7 +186,7 @@
         <w:pStyle w:val="FirstParagraph"/>
       </w:pPr>
       <w:r>
-        <w:t>The argument is that the hotel delivers its premium promise where guests look first (public spaces, breakfast, bar) and under-delivers where they look closely (condition and consistency). That gap matters because the room is sold as a premium product: staff quoted about £300 a night and a booking site listed about £236 to £309 (Booking.com, 2026; Fig. 10). Chapter 2 sets out the method, Chapters 3 and 4 the tools and the decisions, Chapter 5 the evidence, and Chapters 6 and 7 the recommendations and conclusion.</w:t>
+        <w:t>The argument is that the hotel delivers its premium promise where guests look first (public spaces, breakfast, bar) and under-delivers where they look closely (condition and consistency). That gap matters because the room is sold as a premium product: staff quoted about £300 a night and a booking site listed about £237 to £310 (Booking.com, 2026; Fig. 10). Chapter 2 sets out the method, Chapters 3 and 4 the tools and the decisions, Chapter 5 the evidence, and Chapters 6 and 7 the recommendations and conclusion.</w:t>
       </w:r>
     </w:p>
     <w:bookmarkEnd w:id="20"/>
@@ -334,7 +334,7 @@
         <w:t xml:space="preserve"> </w:t>
       </w:r>
       <w:r>
-        <w:t>Zeithaml (1988) places value in the guest’s head, so it differs between guests. Xia, Monroe and Cox (2004) add that price differences are judged for fairness, and Kimes (2002) notes that yield pricing is rational for the hotel yet can feel unfair. Rooms quoted at about £300 on the visit, and listed at about £236 to £309 on a booking site depending on discounts (Fig. 10), mean guests pay different amounts for the same room and so hold different yardsticks. The same lift door can be forgiven at a discounted price and resented at the full one.</w:t>
+        <w:t>Zeithaml (1988) places value in the guest’s head, so it differs between guests. Xia, Monroe and Cox (2004) add that price differences are judged for fairness, and Kimes (2002) notes that yield pricing is rational for the hotel yet can feel unfair. Rooms quoted at about £300 on the visit, and listed at about £237 to £310 on a booking site depending on discounts (Fig. 10), mean guests pay different amounts for the same room and so hold different yardsticks. The same lift door can be forgiven at a discounted price and resented at the full one.</w:t>
       </w:r>
     </w:p>
     <w:p>
@@ -510,7 +510,7 @@
         <w:pStyle w:val="BodyText"/>
       </w:pPr>
       <w:r>
-        <w:t>Price changes how all this reads. The author, who comes from a middle-class family in Nepal, would not pay £300 a night for this hotel: the sum equals roughly NPR 61,500 at an approximate mid-2026 rate of 205 NPR to the pound, a large amount for a middle-class household, and a stay in this bracket is out of reach for many guests. This is a point about affordability, not about value. Zeithaml (1988) places value in the guest’s head, so the same room can be fair value to one guest and unaffordable to another.</w:t>
+        <w:t>Price changes how all this reads. The author, who comes from a middle-class family in Nepal, would not pay £300 a night for this hotel: the sum equals roughly NPR 61,300 at 204.23 NPR to the pound on 8 October 2026 (Google Finance, 2026), a large amount for a middle-class household, and a stay in this bracket is out of reach for many guests. This is a point about affordability, not about value. Zeithaml (1988) places value in the guest’s head, so the same room can be fair value to one guest and unaffordable to another.</w:t>
       </w:r>
     </w:p>
     <w:p>
@@ -952,6 +952,14 @@
       </w:r>
       <w:r>
         <w:t xml:space="preserve">, 25(5), pp. 395-410.</w:t>
+      </w:r>
+    </w:p>
+    <w:p>
+      <w:pPr>
+        <w:pStyle w:val="BodyText"/>
+      </w:pPr>
+      <w:r>
+        <w:t>Google Finance (2026) GBP to NPR exchange rate, 8 October 2026, 01:00 UTC. Available at: https://www.google.com/finance/quote/GBP-NPR (Accessed: 8 October 2026).</w:t>
       </w:r>
     </w:p>
     <w:p>
@@ -3521,7 +3529,7 @@
               <w:jc w:val="left"/>
             </w:pPr>
             <w:r>
-              <w:t>Rooms about £300 (staff); about £236 to £309 (booking site, 8–9 Nov 2026)</w:t>
+              <w:t>Rooms about £300 (staff); about £237 to £310 (booking site, 8–9 Nov 2026)</w:t>
             </w:r>
           </w:p>
         </w:tc>
@@ -3545,7 +3553,7 @@
               <w:jc w:val="left"/>
             </w:pPr>
             <w:r>
-              <w:t>Screenshot captured 8 October 2026 (Fig. 10): standard NPR 63,249 (about £309), member deal NPR 48,385 (about £236), at about 205 NPR to the pound. Hotel page confirmed from the URL</w:t>
+              <w:t>Screenshot captured 8 October 2026 (Fig. 10): standard NPR 63,249 (about £310), member deal NPR 48,385 (about £237), at 204.23 NPR to the pound on 8 October 2026 (Google Finance, 2026). Hotel page confirmed from the URL</w:t>
             </w:r>
           </w:p>
         </w:tc>

</xml_diff>

<commit_message>
Cite Google exchange-rate search as the rate source
Co-Authored-By: Claude Sonnet 5.5 <noreply@anthropic.com>
Claude-Session: https://claude.ai/code/session_01Lhz1QoiDKSSfhd771XL9yY
</commit_message>
<xml_diff>
--- a/Bibisha-Melia-Promise-and-Proof-report_updated.docx
+++ b/Bibisha-Melia-Promise-and-Proof-report_updated.docx
@@ -510,7 +510,7 @@
         <w:pStyle w:val="BodyText"/>
       </w:pPr>
       <w:r>
-        <w:t>Price changes how all this reads. The author, who comes from a middle-class family in Nepal, would not pay £300 a night for this hotel: the sum equals roughly NPR 61,300 at 204.23 NPR to the pound on 8 October 2026 (Google Finance, 2026), a large amount for a middle-class household, and a stay in this bracket is out of reach for many guests. This is a point about affordability, not about value. Zeithaml (1988) places value in the guest’s head, so the same room can be fair value to one guest and unaffordable to another.</w:t>
+        <w:t>Price changes how all this reads. The author, who comes from a middle-class family in Nepal, would not pay £300 a night for this hotel: the sum equals roughly NPR 61,300 at 204.23 NPR to the pound on 8 October 2026 (Google, 2026), a large amount for a middle-class household, and a stay in this bracket is out of reach for many guests. This is a point about affordability, not about value. Zeithaml (1988) places value in the guest’s head, so the same room can be fair value to one guest and unaffordable to another.</w:t>
       </w:r>
     </w:p>
     <w:p>
@@ -959,7 +959,7 @@
         <w:pStyle w:val="BodyText"/>
       </w:pPr>
       <w:r>
-        <w:t>Google Finance (2026) GBP to NPR exchange rate, 8 October 2026, 01:00 UTC. Available at: https://www.google.com/finance/quote/GBP-NPR (Accessed: 8 October 2026).</w:t>
+        <w:t>Google (2026) Pound sterling to Nepalese rupee exchange rate, 8 October 2026, 01:00 UTC. Available at: https://www.google.com/search?q=PUND+TO+NRP+RATE (Accessed: 8 October 2026).</w:t>
       </w:r>
     </w:p>
     <w:p>

</xml_diff>

<commit_message>
Add DOI and publisher links to journal references
Co-Authored-By: Claude Sonnet 5.5 <noreply@anthropic.com>
Claude-Session: https://claude.ai/code/session_01Lhz1QoiDKSSfhd771XL9yY
</commit_message>
<xml_diff>
--- a/Bibisha-Melia-Promise-and-Proof-report_updated.docx
+++ b/Bibisha-Melia-Promise-and-Proof-report_updated.docx
@@ -738,7 +738,7 @@
         <w:t xml:space="preserve">Harvard Business Review</w:t>
       </w:r>
       <w:r>
-        <w:t xml:space="preserve">, 35(5), pp. 113-124.</w:t>
+        <w:t>, 35(5), pp. 113-124. Available at: https://hbr.org/1957/09/strategies-for-diversification (Accessed: 8 October 2026).</w:t>
       </w:r>
     </w:p>
     <w:p>
@@ -766,7 +766,7 @@
         <w:t xml:space="preserve">Meliá recognized in the S&amp;P Global Sustainability Yearbook 2026 for the ninth consecutive year</w:t>
       </w:r>
       <w:r>
-        <w:t xml:space="preserve">’</w:t>
+        <w:t>’.</w:t>
       </w:r>
       <w:r>
         <w:t xml:space="preserve"> </w:t>
@@ -915,7 +915,7 @@
         <w:t xml:space="preserve">Strategic Management Journal</w:t>
       </w:r>
       <w:r>
-        <w:t xml:space="preserve">, 21(10-11), pp. 1105-1121.</w:t>
+        <w:t>, 21(10-11), pp. 1105-1121. Available at: https://doi.org/10.1002/1097-0266(200010/11)21:10/11&lt;1105::AID-SMJ133&gt;3.0.CO;2-E (Accessed: 8 October 2026).</w:t>
       </w:r>
     </w:p>
     <w:p>
@@ -951,7 +951,7 @@
         <w:t xml:space="preserve">European Management Journal</w:t>
       </w:r>
       <w:r>
-        <w:t xml:space="preserve">, 25(5), pp. 395-410.</w:t>
+        <w:t>, 25(5), pp. 395-410. Available at: https://doi.org/10.1016/j.emj.2007.08.005 (Accessed: 8 October 2026).</w:t>
       </w:r>
     </w:p>
     <w:p>
@@ -995,7 +995,7 @@
         <w:t xml:space="preserve">California Management Review</w:t>
       </w:r>
       <w:r>
-        <w:t xml:space="preserve">, 33(3), pp. 114-135.</w:t>
+        <w:t>, 33(3), pp. 114-135. Available at: https://doi.org/10.2307/41166664 (Accessed: 8 October 2026).</w:t>
       </w:r>
     </w:p>
     <w:p>
@@ -1052,7 +1052,7 @@
         <w:t xml:space="preserve">European Journal of Marketing</w:t>
       </w:r>
       <w:r>
-        <w:t xml:space="preserve">, 18(4), pp. 36-44.</w:t>
+        <w:t>, 18(4), pp. 36-44. Available at: https://doi.org/10.1108/EUM0000000004784 (Accessed: 8 October 2026).</w:t>
       </w:r>
     </w:p>
     <w:p>
@@ -1192,7 +1192,7 @@
         <w:t xml:space="preserve">Harvard Business Review</w:t>
       </w:r>
       <w:r>
-        <w:t xml:space="preserve">, 82(10), pp. 76-84.</w:t>
+        <w:t>, 82(10), pp. 76-84. Available at: https://hbr.org/2004/10/blue-ocean-strategy (Accessed: 8 October 2026).</w:t>
       </w:r>
     </w:p>
     <w:p>
@@ -1264,7 +1264,7 @@
         <w:t xml:space="preserve">International Journal of Contemporary Hospitality Management</w:t>
       </w:r>
       <w:r>
-        <w:t xml:space="preserve">, 19(5), pp. 364-377.</w:t>
+        <w:t>, 19(5), pp. 364-377. Available at: https://doi.org/10.1108/09596110710757534 (Accessed: 8 October 2026).</w:t>
       </w:r>
     </w:p>
     <w:p>
@@ -1300,7 +1300,7 @@
         <w:t xml:space="preserve">Journal of Service Research</w:t>
       </w:r>
       <w:r>
-        <w:t xml:space="preserve">, 3(2), pp. 121-137.</w:t>
+        <w:t>, 3(2), pp. 121-137. Available at: https://doi.org/10.1177/109467050032002 (Accessed: 8 October 2026).</w:t>
       </w:r>
     </w:p>
     <w:p>
@@ -1357,7 +1357,7 @@
         <w:t xml:space="preserve">International Journal of Contemporary Hospitality Management</w:t>
       </w:r>
       <w:r>
-        <w:t xml:space="preserve">, 11(7), pp. 326-339.</w:t>
+        <w:t>, 11(7), pp. 326-339. Available at: https://doi.org/10.1108/09596119910293231 (Accessed: 8 October 2026).</w:t>
       </w:r>
     </w:p>
     <w:p>
@@ -1393,7 +1393,7 @@
         <w:t xml:space="preserve">Annals of Tourism Research</w:t>
       </w:r>
       <w:r>
-        <w:t xml:space="preserve">, 30(1), pp. 238-254.</w:t>
+        <w:t>, 30(1), pp. 238-254. Available at: https://doi.org/10.1016/S0160-7383(02)00064-6 (Accessed: 8 October 2026).</w:t>
       </w:r>
     </w:p>
     <w:p>
@@ -1429,7 +1429,7 @@
         <w:t xml:space="preserve">Journal of Marketing Research</w:t>
       </w:r>
       <w:r>
-        <w:t xml:space="preserve">, 36(3), pp. 356-372.</w:t>
+        <w:t>, 36(3), pp. 356-372. Available at: https://doi.org/10.1177/002224379903600305 (Accessed: 8 October 2026).</w:t>
       </w:r>
     </w:p>
     <w:p>
@@ -1465,7 +1465,7 @@
         <w:t xml:space="preserve">Harvard Business Review</w:t>
       </w:r>
       <w:r>
-        <w:t xml:space="preserve">, 71(1), pp. 84-93.</w:t>
+        <w:t>, 71(1), pp. 84-93. Available at: https://hbr.org/1993/01/customer-intimacy-and-other-value-disciplines (Accessed: 8 October 2026).</w:t>
       </w:r>
     </w:p>
     <w:p>
@@ -1501,7 +1501,7 @@
         <w:t xml:space="preserve">Journal of Business Research</w:t>
       </w:r>
       <w:r>
-        <w:t xml:space="preserve">, 49(2), pp. 193-211.</w:t>
+        <w:t>, 49(2), pp. 193-211. Available at: https://doi.org/10.1016/S0148-2963(99)00010-7 (Accessed: 8 October 2026).</w:t>
       </w:r>
     </w:p>
     <w:p>
@@ -1558,7 +1558,7 @@
         <w:t xml:space="preserve">Journal of Marketing</w:t>
       </w:r>
       <w:r>
-        <w:t xml:space="preserve">, 68(4), pp. 1-15.</w:t>
+        <w:t>, 68(4), pp. 1-15. Available at: https://doi.org/10.1509/jmkg.68.4.1.42733 (Accessed: 8 October 2026).</w:t>
       </w:r>
     </w:p>
     <w:p>
@@ -1615,7 +1615,7 @@
         <w:t xml:space="preserve">Journal of Marketing</w:t>
       </w:r>
       <w:r>
-        <w:t xml:space="preserve">, 52(3), pp. 2-22.</w:t>
+        <w:t>, 52(3), pp. 2-22. Available at: https://doi.org/10.1177/002224298805200302 (Accessed: 8 October 2026).</w:t>
       </w:r>
     </w:p>
     <w:p>
@@ -1651,7 +1651,7 @@
         <w:t xml:space="preserve">Journal of Service Research</w:t>
       </w:r>
       <w:r>
-        <w:t xml:space="preserve">, 13(1), pp. 67-82.</w:t>
+        <w:t>, 13(1), pp. 67-82. Available at: https://doi.org/10.1177/1094670509357611 (Accessed: 8 October 2026).</w:t>
       </w:r>
     </w:p>
     <w:bookmarkEnd w:id="27"/>

</xml_diff>

<commit_message>
Make reference URLs clickable hyperlinks
Co-Authored-By: Claude Sonnet 5.5 <noreply@anthropic.com>
Claude-Session: https://claude.ai/code/session_01Lhz1QoiDKSSfhd771XL9yY
</commit_message>
<xml_diff>
--- a/Bibisha-Melia-Promise-and-Proof-report_updated.docx
+++ b/Bibisha-Melia-Promise-and-Proof-report_updated.docx
@@ -738,15 +738,39 @@
         <w:t xml:space="preserve">Harvard Business Review</w:t>
       </w:r>
       <w:r>
-        <w:t>, 35(5), pp. 113-124. Available at: https://hbr.org/1957/09/strategies-for-diversification (Accessed: 8 October 2026).</w:t>
-      </w:r>
-    </w:p>
-    <w:p>
-      <w:pPr>
-        <w:pStyle w:val="BodyText"/>
-      </w:pPr>
-      <w:r>
-        <w:t>Booking.com (2026) Availability: Meliá White House, Deluxe Double Room, 8–9 November 2026 [screenshot of booking page, captured 8 October 2026]. Available at: https://www.booking.com/hotel/gb/meliawhitehousehotel.en-gb.html?checkin=2026-11-08&amp;checkout=2026-11-09 (Accessed: 8 October 2026).</w:t>
+        <w:t xml:space="preserve">, 35(5), pp. 113-124. Available at: </w:t>
+      </w:r>
+      <w:hyperlink r:id="rId10">
+        <w:r>
+          <w:rPr>
+            <w:color w:val="0563C1"/>
+            <w:u w:val="single"/>
+          </w:rPr>
+          <w:t>https://hbr.org/1957/09/strategies-for-diversification</w:t>
+        </w:r>
+      </w:hyperlink>
+      <w:r>
+        <w:t xml:space="preserve"> (Accessed: 8 October 2026).</w:t>
+      </w:r>
+    </w:p>
+    <w:p>
+      <w:pPr>
+        <w:pStyle w:val="BodyText"/>
+      </w:pPr>
+      <w:r>
+        <w:t xml:space="preserve">Booking.com (2026) Availability: Meliá White House, Deluxe Double Room, 8–9 November 2026 [screenshot of booking page, captured 8 October 2026]. Available at: </w:t>
+      </w:r>
+      <w:hyperlink r:id="rId11">
+        <w:r>
+          <w:rPr>
+            <w:color w:val="0563C1"/>
+            <w:u w:val="single"/>
+          </w:rPr>
+          <w:t>https://www.booking.com/hotel/gb/meliawhitehousehotel.en-gb.html?checkin=2026-11-08&amp;checkout=2026-11-09</w:t>
+        </w:r>
+      </w:hyperlink>
+      <w:r>
+        <w:t xml:space="preserve"> (Accessed: 8 October 2026).</w:t>
       </w:r>
     </w:p>
     <w:p>
@@ -772,7 +796,19 @@
         <w:t xml:space="preserve"> </w:t>
       </w:r>
       <w:r>
-        <w:t>Available at: https://www.breakingtravelnews.com/news/article/melia-recognized-in-the-sp-global-sustainability-yearbook-2026-for-the-nint/ (Accessed: 8 October 2026).</w:t>
+        <w:t xml:space="preserve">Available at: </w:t>
+      </w:r>
+      <w:hyperlink r:id="rId12">
+        <w:r>
+          <w:rPr>
+            <w:color w:val="0563C1"/>
+            <w:u w:val="single"/>
+          </w:rPr>
+          <w:t>https://www.breakingtravelnews.com/news/article/melia-recognized-in-the-sp-global-sustainability-yearbook-2026-for-the-nint/</w:t>
+        </w:r>
+      </w:hyperlink>
+      <w:r>
+        <w:t xml:space="preserve"> (Accessed: 8 October 2026).</w:t>
       </w:r>
     </w:p>
     <w:p>
@@ -816,7 +852,19 @@
         <w:t xml:space="preserve">’</w:t>
       </w:r>
       <w:r>
-        <w:t xml:space="preserve">, 21 April. Available at: https://www.businesstraveller.com/business-travel/2024/04/21/londons-melia-white-house-introduces-co-working-spaces/ (Accessed: 8 October 2026).</w:t>
+        <w:t xml:space="preserve">, 21 April. Available at: </w:t>
+      </w:r>
+      <w:hyperlink r:id="rId13">
+        <w:r>
+          <w:rPr>
+            <w:color w:val="0563C1"/>
+            <w:u w:val="single"/>
+          </w:rPr>
+          <w:t>https://www.businesstraveller.com/business-travel/2024/04/21/londons-melia-white-house-introduces-co-working-spaces/</w:t>
+        </w:r>
+      </w:hyperlink>
+      <w:r>
+        <w:t xml:space="preserve"> (Accessed: 8 October 2026).</w:t>
       </w:r>
     </w:p>
     <w:p>
@@ -915,7 +963,19 @@
         <w:t xml:space="preserve">Strategic Management Journal</w:t>
       </w:r>
       <w:r>
-        <w:t>, 21(10-11), pp. 1105-1121. Available at: https://doi.org/10.1002/1097-0266(200010/11)21:10/11&lt;1105::AID-SMJ133&gt;3.0.CO;2-E (Accessed: 8 October 2026).</w:t>
+        <w:t xml:space="preserve">, 21(10-11), pp. 1105-1121. Available at: </w:t>
+      </w:r>
+      <w:hyperlink r:id="rId14">
+        <w:r>
+          <w:rPr>
+            <w:color w:val="0563C1"/>
+            <w:u w:val="single"/>
+          </w:rPr>
+          <w:t>https://doi.org/10.1002/1097-0266(200010/11)21:10/11&lt;1105::AID-SMJ133&gt;3.0.CO;2-E</w:t>
+        </w:r>
+      </w:hyperlink>
+      <w:r>
+        <w:t xml:space="preserve"> (Accessed: 8 October 2026).</w:t>
       </w:r>
     </w:p>
     <w:p>
@@ -951,15 +1011,39 @@
         <w:t xml:space="preserve">European Management Journal</w:t>
       </w:r>
       <w:r>
-        <w:t>, 25(5), pp. 395-410. Available at: https://doi.org/10.1016/j.emj.2007.08.005 (Accessed: 8 October 2026).</w:t>
-      </w:r>
-    </w:p>
-    <w:p>
-      <w:pPr>
-        <w:pStyle w:val="BodyText"/>
-      </w:pPr>
-      <w:r>
-        <w:t>Google (2026) Pound sterling to Nepalese rupee exchange rate, 8 October 2026, 01:00 UTC. Available at: https://www.google.com/search?q=PUND+TO+NRP+RATE (Accessed: 8 October 2026).</w:t>
+        <w:t xml:space="preserve">, 25(5), pp. 395-410. Available at: </w:t>
+      </w:r>
+      <w:hyperlink r:id="rId15">
+        <w:r>
+          <w:rPr>
+            <w:color w:val="0563C1"/>
+            <w:u w:val="single"/>
+          </w:rPr>
+          <w:t>https://doi.org/10.1016/j.emj.2007.08.005</w:t>
+        </w:r>
+      </w:hyperlink>
+      <w:r>
+        <w:t xml:space="preserve"> (Accessed: 8 October 2026).</w:t>
+      </w:r>
+    </w:p>
+    <w:p>
+      <w:pPr>
+        <w:pStyle w:val="BodyText"/>
+      </w:pPr>
+      <w:r>
+        <w:t xml:space="preserve">Google (2026) Pound sterling to Nepalese rupee exchange rate, 8 October 2026, 01:00 UTC. Available at: </w:t>
+      </w:r>
+      <w:hyperlink r:id="rId16">
+        <w:r>
+          <w:rPr>
+            <w:color w:val="0563C1"/>
+            <w:u w:val="single"/>
+          </w:rPr>
+          <w:t>https://www.google.com/search?q=PUND+TO+NRP+RATE</w:t>
+        </w:r>
+      </w:hyperlink>
+      <w:r>
+        <w:t xml:space="preserve"> (Accessed: 8 October 2026).</w:t>
       </w:r>
     </w:p>
     <w:p>
@@ -995,7 +1079,19 @@
         <w:t xml:space="preserve">California Management Review</w:t>
       </w:r>
       <w:r>
-        <w:t>, 33(3), pp. 114-135. Available at: https://doi.org/10.2307/41166664 (Accessed: 8 October 2026).</w:t>
+        <w:t xml:space="preserve">, 33(3), pp. 114-135. Available at: </w:t>
+      </w:r>
+      <w:hyperlink r:id="rId17">
+        <w:r>
+          <w:rPr>
+            <w:color w:val="0563C1"/>
+            <w:u w:val="single"/>
+          </w:rPr>
+          <w:t>https://doi.org/10.2307/41166664</w:t>
+        </w:r>
+      </w:hyperlink>
+      <w:r>
+        <w:t xml:space="preserve"> (Accessed: 8 October 2026).</w:t>
       </w:r>
     </w:p>
     <w:p>
@@ -1052,7 +1148,19 @@
         <w:t xml:space="preserve">European Journal of Marketing</w:t>
       </w:r>
       <w:r>
-        <w:t>, 18(4), pp. 36-44. Available at: https://doi.org/10.1108/EUM0000000004784 (Accessed: 8 October 2026).</w:t>
+        <w:t xml:space="preserve">, 18(4), pp. 36-44. Available at: </w:t>
+      </w:r>
+      <w:hyperlink r:id="rId18">
+        <w:r>
+          <w:rPr>
+            <w:color w:val="0563C1"/>
+            <w:u w:val="single"/>
+          </w:rPr>
+          <w:t>https://doi.org/10.1108/EUM0000000004784</w:t>
+        </w:r>
+      </w:hyperlink>
+      <w:r>
+        <w:t xml:space="preserve"> (Accessed: 8 October 2026).</w:t>
       </w:r>
     </w:p>
     <w:p>
@@ -1073,7 +1181,19 @@
         <w:t xml:space="preserve">National Heritage List for England: The White House, Albany Street</w:t>
       </w:r>
       <w:r>
-        <w:t xml:space="preserve">, list entry 1113231. Available at: https://historicengland.org.uk/listing/the-list/list-entry/1113231 (Accessed: 8 October 2026).</w:t>
+        <w:t xml:space="preserve">, list entry 1113231. Available at: </w:t>
+      </w:r>
+      <w:hyperlink r:id="rId19">
+        <w:r>
+          <w:rPr>
+            <w:color w:val="0563C1"/>
+            <w:u w:val="single"/>
+          </w:rPr>
+          <w:t>https://historicengland.org.uk/listing/the-list/list-entry/1113231</w:t>
+        </w:r>
+      </w:hyperlink>
+      <w:r>
+        <w:t xml:space="preserve"> (Accessed: 8 October 2026).</w:t>
       </w:r>
     </w:p>
     <w:p>
@@ -1097,7 +1217,19 @@
         <w:t xml:space="preserve"> </w:t>
       </w:r>
       <w:r>
-        <w:t>[press release]. Available at: https://www.hospitalitynet.org/announcement/41009454.html (Accessed: 8 October 2026).</w:t>
+        <w:t xml:space="preserve">[press release]. Available at: </w:t>
+      </w:r>
+      <w:hyperlink r:id="rId20">
+        <w:r>
+          <w:rPr>
+            <w:color w:val="0563C1"/>
+            <w:u w:val="single"/>
+          </w:rPr>
+          <w:t>https://www.hospitalitynet.org/announcement/41009454.html</w:t>
+        </w:r>
+      </w:hyperlink>
+      <w:r>
+        <w:t xml:space="preserve"> (Accessed: 8 October 2026).</w:t>
       </w:r>
     </w:p>
     <w:p>
@@ -1120,7 +1252,19 @@
         <w:t xml:space="preserve">’</w:t>
       </w:r>
       <w:r>
-        <w:t xml:space="preserve">, 3 August. Available at: https://www.journaldespalaces.com/en/pressrelease-79079-Luxury-focus-drives-Meliy-into-the-World-s-Top-10-Strongest-Hotel-Brands.html (Accessed: 8 October 2026).</w:t>
+        <w:t xml:space="preserve">, 3 August. Available at: </w:t>
+      </w:r>
+      <w:hyperlink r:id="rId21">
+        <w:r>
+          <w:rPr>
+            <w:color w:val="0563C1"/>
+            <w:u w:val="single"/>
+          </w:rPr>
+          <w:t>https://www.journaldespalaces.com/en/pressrelease-79079-Luxury-focus-drives-Meliy-into-the-World-s-Top-10-Strongest-Hotel-Brands.html</w:t>
+        </w:r>
+      </w:hyperlink>
+      <w:r>
+        <w:t xml:space="preserve"> (Accessed: 8 October 2026).</w:t>
       </w:r>
     </w:p>
     <w:p>
@@ -1192,7 +1336,19 @@
         <w:t xml:space="preserve">Harvard Business Review</w:t>
       </w:r>
       <w:r>
-        <w:t>, 82(10), pp. 76-84. Available at: https://hbr.org/2004/10/blue-ocean-strategy (Accessed: 8 October 2026).</w:t>
+        <w:t xml:space="preserve">, 82(10), pp. 76-84. Available at: </w:t>
+      </w:r>
+      <w:hyperlink r:id="rId22">
+        <w:r>
+          <w:rPr>
+            <w:color w:val="0563C1"/>
+            <w:u w:val="single"/>
+          </w:rPr>
+          <w:t>https://hbr.org/2004/10/blue-ocean-strategy</w:t>
+        </w:r>
+      </w:hyperlink>
+      <w:r>
+        <w:t xml:space="preserve"> (Accessed: 8 October 2026).</w:t>
       </w:r>
     </w:p>
     <w:p>
@@ -1264,7 +1420,19 @@
         <w:t xml:space="preserve">International Journal of Contemporary Hospitality Management</w:t>
       </w:r>
       <w:r>
-        <w:t>, 19(5), pp. 364-377. Available at: https://doi.org/10.1108/09596110710757534 (Accessed: 8 October 2026).</w:t>
+        <w:t xml:space="preserve">, 19(5), pp. 364-377. Available at: </w:t>
+      </w:r>
+      <w:hyperlink r:id="rId23">
+        <w:r>
+          <w:rPr>
+            <w:color w:val="0563C1"/>
+            <w:u w:val="single"/>
+          </w:rPr>
+          <w:t>https://doi.org/10.1108/09596110710757534</w:t>
+        </w:r>
+      </w:hyperlink>
+      <w:r>
+        <w:t xml:space="preserve"> (Accessed: 8 October 2026).</w:t>
       </w:r>
     </w:p>
     <w:p>
@@ -1300,7 +1468,19 @@
         <w:t xml:space="preserve">Journal of Service Research</w:t>
       </w:r>
       <w:r>
-        <w:t>, 3(2), pp. 121-137. Available at: https://doi.org/10.1177/109467050032002 (Accessed: 8 October 2026).</w:t>
+        <w:t xml:space="preserve">, 3(2), pp. 121-137. Available at: </w:t>
+      </w:r>
+      <w:hyperlink r:id="rId24">
+        <w:r>
+          <w:rPr>
+            <w:color w:val="0563C1"/>
+            <w:u w:val="single"/>
+          </w:rPr>
+          <w:t>https://doi.org/10.1177/109467050032002</w:t>
+        </w:r>
+      </w:hyperlink>
+      <w:r>
+        <w:t xml:space="preserve"> (Accessed: 8 October 2026).</w:t>
       </w:r>
     </w:p>
     <w:p>
@@ -1357,7 +1537,19 @@
         <w:t xml:space="preserve">International Journal of Contemporary Hospitality Management</w:t>
       </w:r>
       <w:r>
-        <w:t>, 11(7), pp. 326-339. Available at: https://doi.org/10.1108/09596119910293231 (Accessed: 8 October 2026).</w:t>
+        <w:t xml:space="preserve">, 11(7), pp. 326-339. Available at: </w:t>
+      </w:r>
+      <w:hyperlink r:id="rId25">
+        <w:r>
+          <w:rPr>
+            <w:color w:val="0563C1"/>
+            <w:u w:val="single"/>
+          </w:rPr>
+          <w:t>https://doi.org/10.1108/09596119910293231</w:t>
+        </w:r>
+      </w:hyperlink>
+      <w:r>
+        <w:t xml:space="preserve"> (Accessed: 8 October 2026).</w:t>
       </w:r>
     </w:p>
     <w:p>
@@ -1393,7 +1585,19 @@
         <w:t xml:space="preserve">Annals of Tourism Research</w:t>
       </w:r>
       <w:r>
-        <w:t>, 30(1), pp. 238-254. Available at: https://doi.org/10.1016/S0160-7383(02)00064-6 (Accessed: 8 October 2026).</w:t>
+        <w:t xml:space="preserve">, 30(1), pp. 238-254. Available at: </w:t>
+      </w:r>
+      <w:hyperlink r:id="rId26">
+        <w:r>
+          <w:rPr>
+            <w:color w:val="0563C1"/>
+            <w:u w:val="single"/>
+          </w:rPr>
+          <w:t>https://doi.org/10.1016/S0160-7383(02)00064-6</w:t>
+        </w:r>
+      </w:hyperlink>
+      <w:r>
+        <w:t xml:space="preserve"> (Accessed: 8 October 2026).</w:t>
       </w:r>
     </w:p>
     <w:p>
@@ -1429,7 +1633,19 @@
         <w:t xml:space="preserve">Journal of Marketing Research</w:t>
       </w:r>
       <w:r>
-        <w:t>, 36(3), pp. 356-372. Available at: https://doi.org/10.1177/002224379903600305 (Accessed: 8 October 2026).</w:t>
+        <w:t xml:space="preserve">, 36(3), pp. 356-372. Available at: </w:t>
+      </w:r>
+      <w:hyperlink r:id="rId27">
+        <w:r>
+          <w:rPr>
+            <w:color w:val="0563C1"/>
+            <w:u w:val="single"/>
+          </w:rPr>
+          <w:t>https://doi.org/10.1177/002224379903600305</w:t>
+        </w:r>
+      </w:hyperlink>
+      <w:r>
+        <w:t xml:space="preserve"> (Accessed: 8 October 2026).</w:t>
       </w:r>
     </w:p>
     <w:p>
@@ -1465,7 +1681,19 @@
         <w:t xml:space="preserve">Harvard Business Review</w:t>
       </w:r>
       <w:r>
-        <w:t>, 71(1), pp. 84-93. Available at: https://hbr.org/1993/01/customer-intimacy-and-other-value-disciplines (Accessed: 8 October 2026).</w:t>
+        <w:t xml:space="preserve">, 71(1), pp. 84-93. Available at: </w:t>
+      </w:r>
+      <w:hyperlink r:id="rId29">
+        <w:r>
+          <w:rPr>
+            <w:color w:val="0563C1"/>
+            <w:u w:val="single"/>
+          </w:rPr>
+          <w:t>https://hbr.org/1993/01/customer-intimacy-and-other-value-disciplines</w:t>
+        </w:r>
+      </w:hyperlink>
+      <w:r>
+        <w:t xml:space="preserve"> (Accessed: 8 October 2026).</w:t>
       </w:r>
     </w:p>
     <w:p>
@@ -1501,7 +1729,19 @@
         <w:t xml:space="preserve">Journal of Business Research</w:t>
       </w:r>
       <w:r>
-        <w:t>, 49(2), pp. 193-211. Available at: https://doi.org/10.1016/S0148-2963(99)00010-7 (Accessed: 8 October 2026).</w:t>
+        <w:t xml:space="preserve">, 49(2), pp. 193-211. Available at: </w:t>
+      </w:r>
+      <w:hyperlink r:id="rId30">
+        <w:r>
+          <w:rPr>
+            <w:color w:val="0563C1"/>
+            <w:u w:val="single"/>
+          </w:rPr>
+          <w:t>https://doi.org/10.1016/S0148-2963(99)00010-7</w:t>
+        </w:r>
+      </w:hyperlink>
+      <w:r>
+        <w:t xml:space="preserve"> (Accessed: 8 October 2026).</w:t>
       </w:r>
     </w:p>
     <w:p>
@@ -1558,7 +1798,19 @@
         <w:t xml:space="preserve">Journal of Marketing</w:t>
       </w:r>
       <w:r>
-        <w:t>, 68(4), pp. 1-15. Available at: https://doi.org/10.1509/jmkg.68.4.1.42733 (Accessed: 8 October 2026).</w:t>
+        <w:t xml:space="preserve">, 68(4), pp. 1-15. Available at: </w:t>
+      </w:r>
+      <w:hyperlink r:id="rId32">
+        <w:r>
+          <w:rPr>
+            <w:color w:val="0563C1"/>
+            <w:u w:val="single"/>
+          </w:rPr>
+          <w:t>https://doi.org/10.1509/jmkg.68.4.1.42733</w:t>
+        </w:r>
+      </w:hyperlink>
+      <w:r>
+        <w:t xml:space="preserve"> (Accessed: 8 October 2026).</w:t>
       </w:r>
     </w:p>
     <w:p>
@@ -1615,7 +1867,19 @@
         <w:t xml:space="preserve">Journal of Marketing</w:t>
       </w:r>
       <w:r>
-        <w:t>, 52(3), pp. 2-22. Available at: https://doi.org/10.1177/002224298805200302 (Accessed: 8 October 2026).</w:t>
+        <w:t xml:space="preserve">, 52(3), pp. 2-22. Available at: </w:t>
+      </w:r>
+      <w:hyperlink r:id="rId33">
+        <w:r>
+          <w:rPr>
+            <w:color w:val="0563C1"/>
+            <w:u w:val="single"/>
+          </w:rPr>
+          <w:t>https://doi.org/10.1177/002224298805200302</w:t>
+        </w:r>
+      </w:hyperlink>
+      <w:r>
+        <w:t xml:space="preserve"> (Accessed: 8 October 2026).</w:t>
       </w:r>
     </w:p>
     <w:p>
@@ -1651,7 +1915,19 @@
         <w:t xml:space="preserve">Journal of Service Research</w:t>
       </w:r>
       <w:r>
-        <w:t>, 13(1), pp. 67-82. Available at: https://doi.org/10.1177/1094670509357611 (Accessed: 8 October 2026).</w:t>
+        <w:t xml:space="preserve">, 13(1), pp. 67-82. Available at: </w:t>
+      </w:r>
+      <w:hyperlink r:id="rId35">
+        <w:r>
+          <w:rPr>
+            <w:color w:val="0563C1"/>
+            <w:u w:val="single"/>
+          </w:rPr>
+          <w:t>https://doi.org/10.1177/1094670509357611</w:t>
+        </w:r>
+      </w:hyperlink>
+      <w:r>
+        <w:t xml:space="preserve"> (Accessed: 8 October 2026).</w:t>
       </w:r>
     </w:p>
     <w:bookmarkEnd w:id="27"/>

</xml_diff>